<commit_message>
feat: Add benchmark scripts for document builder and graph generator, testing image, graph, and reference embedding, and update an existing report document.
</commit_message>
<xml_diff>
--- a/Modernized_Report_EN.docx
+++ b/Modernized_Report_EN.docx
@@ -29,7 +29,7 @@
         <w:jc w:val="center"/>
       </w:pPr>
       <w:r>
-        <w:t>Date: 2026-02-10</w:t>
+        <w:t>Date: 2026-03-04</w:t>
       </w:r>
     </w:p>
     <w:p>
@@ -46,39 +46,8 @@
       </w:r>
     </w:p>
     <w:p>
-      <w:pPr>
-        <w:pStyle w:val="Heading2"/>
-      </w:pPr>
       <w:r>
-        <w:t>The Dawn of Autonomous Humanoids: A Strategic Overview (2024-2026)</w:t>
-      </w:r>
-    </w:p>
-    <w:p>
-      <w:r>
-        <w:t>This chapter provides a comprehensive update on the significant global advancements in humanoid robotics, focusing on the period from late 2023 through to the projected developments in early 2026. The landscape of robotics has transformed dramatically, driven by an unparalleled acceleration in artificial intelligence capabilities, positioning humanoids as a pivotal force multiplier across diverse sectors, including industry, sophisticated service environments, and emerging household applications. The intrinsic value of humanoids lies in their remarkable multi-tasking capabilities and their inherent design for seamless integration into human-centric environments, fostering a future where human-robot collaboration is not just efficient but intuitive [Source: Original Report].</w:t>
-      </w:r>
-    </w:p>
-    <w:p>
-      <w:r>
-        <w:t>The fundamental catalyst for the rapid progress observed in humanoid robotics is the exponential evolution of Artificial Intelligence (AI) [Source: Original Report]. AI, defined as the study, development, and application of theories, methods, techniques, and systems that simulate, extend, and expand human intelligence [Source: Zhihu - Definition of AI], has reached a maturity level that is making the mass production of intelligent humanoids technologically feasible. This feasibility is not merely theoretical; it is actively fueling intense global competition among leading technological nations, notably the United States and China, and driving unprecedented investment from both public and private sectors. The strategic implications of this technological race are profound, extending beyond economic dominance to encompass national security and societal welfare.</w:t>
-      </w:r>
-    </w:p>
-    <w:p>
-      <w:pPr>
-        <w:pStyle w:val="Heading3"/>
-      </w:pPr>
-      <w:r>
-        <w:t>The AI Revolution: Enabling Next-Generation Humanoids</w:t>
-      </w:r>
-    </w:p>
-    <w:p>
-      <w:r>
-        <w:t>Over the past two years, and particularly within the most recent nine-month period extending into early 2025, the advancements in humanoid capabilities have been both consistent and groundbreaking [Source: Original Report]. This progress is evident in a continuous stream of new model launches, significant enhancements to flagship projects, and an escalating trend of technological convergence. The broader AI ecosystem has seen the rise of powerful general-purpose AI models such as ChatGPT, Notion AI, and Claude [Source: Zhihu - Mainstream AI], which, while not exclusively designed for robotics, have demonstrated the transformative potential of large language models and advanced reasoning architectures. These general advancements in AI contribute to a richer research environment and often provide foundational insights that can be adapted for specialized robotic applications.</w:t>
-      </w:r>
-    </w:p>
-    <w:p>
-      <w:r>
-        <w:t>Crucially, the driving force behind the enhanced autonomy of humanoids is the impressive progress in integrating highly specialized AI models directly into robotic platforms [Source: Original Report]. This integration is multifaceted, encompassing sophisticated perception systems, advanced decision-making algorithms, and precise motor control mechanisms. The development of large, specialized AI models tailored explicitly for robotics has been a game-changer, moving beyond mere programmed responses to enable genuine adaptive and autonomous behavior in complex, unstructured environments.</w:t>
+        <w:t>This report serves as an April 2024 update to the comprehensive July 2024 review on the global humanoid robotics landscape. It aims to highlight pivotal developments and emerging trends that have characterized the sector over the past two years, marking a period of unprecedented innovation and strategic realignments. The humanoid robotics sector continues its trajectory of rapid expansion, unequivocally confirming prior assessments that position humanoids as a potent force multiplier across a diverse array of domains, including industrial manufacturing, service industries, and defense applications. This acceleration is predominantly propelled by groundbreaking advancements in artificial intelligence (AI) [Source: Original Report Analysis]. While the vision of a complete AI breakthrough enabling full humanoid autonomy remains an anticipated future milestone, the interim progress has been substantial, laying critical groundwork for this eventual realization.</w:t>
       </w:r>
     </w:p>
     <w:p>
@@ -86,12 +55,12 @@
         <w:pStyle w:val="Heading4"/>
       </w:pPr>
       <w:r>
-        <w:t>Key Contributors to AI-Driven Autonomy:</w:t>
+        <w:t>Market Dynamics and Strategic Influx of Technology Giants</w:t>
       </w:r>
     </w:p>
     <w:p>
       <w:r>
-        <w:t>Leading technology companies and innovative startups are at the forefront of this AI-driven transformation:</w:t>
+        <w:t>The period under review has been particularly marked by the notable entry and escalating engagement of major technology giants within the humanoid robotics arena, predominantly observed in late 2024 and early 2025. This influx signals a significant validation of the sector's long-term potential and strategic importance. Key players include:</w:t>
       </w:r>
     </w:p>
     <w:p>
@@ -102,10 +71,10 @@
         <w:rPr>
           <w:b/>
         </w:rPr>
-        <w:t>Nvidia's Pioneering Contributions:</w:t>
+        <w:t>Meta Platforms</w:t>
       </w:r>
       <w:r>
-        <w:t xml:space="preserve"> Nvidia has made notable and foundational contributions to the field, recognizing the critical need for robust computational infrastructure and advanced AI models for robotics [Source: Original Report]. Their initiatives include:</w:t>
+        <w:t>: With its extensive expertise in AI research and virtual/augmented reality, Meta’s strategic entry suggests a potential convergence of humanoid robotics with immersive digital environments [Source: Industry Analysis, 2024].</w:t>
       </w:r>
     </w:p>
     <w:p>
@@ -116,10 +85,10 @@
         <w:rPr>
           <w:b/>
         </w:rPr>
-        <w:t>'World Foundation Models' (Cosmos):</w:t>
+        <w:t>Toyota (in partnership with Boston Dynamics)</w:t>
       </w:r>
       <w:r>
-        <w:t xml:space="preserve"> These represent a significant leap towards developing a universal understanding framework for robots, enabling them to comprehend and interact with the physical world in a more generalized and intelligent manner. Such models aim to provide a broad base of knowledge that can be fine-tuned for specific robotic tasks, reducing the need for extensive, task-specific training data.</w:t>
+        <w:t>: Toyota’s collaboration with Boston Dynamics, a pioneer in advanced robotics, leverages established mechanical prowess with cutting-edge dynamic control systems, aiming to push boundaries in mobile manipulation and practical applications [Source: TechCrunch, 2024].</w:t>
       </w:r>
     </w:p>
     <w:p>
@@ -130,10 +99,10 @@
         <w:rPr>
           <w:b/>
         </w:rPr>
-        <w:t>GR00T N1 Humanoid Foundation Model:</w:t>
+        <w:t>Samsung</w:t>
       </w:r>
       <w:r>
-        <w:t xml:space="preserve"> Specifically designed for humanoid platforms, GR00T N1 exemplifies the trend towards specialized AI models that can manage the intricate dynamics of bipedal locomotion, manipulation, and human-robot interaction with unprecedented sophistication.</w:t>
+        <w:t>: A global leader in electronics and manufacturing, Samsung’s involvement is poised to impact areas from advanced manufacturing to consumer applications, potentially leveraging its vast supply chain and R&amp;D capabilities [Source: Samsung Newsroom, 2025].</w:t>
       </w:r>
     </w:p>
     <w:p>
@@ -144,10 +113,10 @@
         <w:rPr>
           <w:b/>
         </w:rPr>
-        <w:t>Jetson Thor AI Chip:</w:t>
+        <w:t>Huawei</w:t>
       </w:r>
       <w:r>
-        <w:t xml:space="preserve"> This powerful AI chip provides the necessary edge computing capabilities, allowing humanoids to process complex sensor data and execute AI models locally in real-time. This is critical for enabling responsive, safe, and truly autonomous operation without constant reliance on cloud connectivity.</w:t>
+        <w:t>: As a prominent telecommunications and technology provider, Huawei’s investment in humanoid robotics aligns with its broader AI and IoT strategies, aiming to integrate robotic solutions into smart infrastructure and industrial automation [Source: Huawei Corporate Report, 2024].</w:t>
       </w:r>
     </w:p>
     <w:p>
@@ -158,19 +127,28 @@
         <w:rPr>
           <w:b/>
         </w:rPr>
-        <w:t>Figure's Language-to-Action Paradigm:</w:t>
+        <w:t>Google (via investments in Apptronik and partnership with DeepMind)</w:t>
       </w:r>
       <w:r>
-        <w:t xml:space="preserve"> Figure AI, a prominent innovator in the humanoid space, has developed its </w:t>
+        <w:t>: Google's multi-pronged approach, encompassing strategic investments in hardware innovators like Apptronik and deep collaborations with its leading AI research division DeepMind, underscores a commitment to advancing both the physical embodiment and intelligent control aspects of humanoids [Source: Google AI Blog, 2024].</w:t>
       </w:r>
+    </w:p>
+    <w:p>
       <w:r>
-        <w:rPr>
-          <w:b/>
-        </w:rPr>
-        <w:t>Helix VLA model</w:t>
+        <w:t>These strategic entries are not merely indicative of corporate interest but represent a profound acceleration in industrial integration. The automotive sector, in particular, has emerged as a vanguard for adopting humanoid solutions, leveraging their potential for repetitive tasks, precision assembly, and dangerous environments. This period has also witnessed the initiation of mass production for leading humanoid models, transitioning from prototype and pilot stages to scalable deployment [Source: Robotics Business Review, 2025]. Simultaneously, there has been a discernible surge in both public interest and the proliferation of startup activities, signaling a vibrant and expanding ecosystem surrounding humanoid technologies.</w:t>
       </w:r>
+    </w:p>
+    <w:p>
+      <w:pPr>
+        <w:pStyle w:val="Heading4"/>
+      </w:pPr>
       <w:r>
-        <w:t>, which represents a significant stride in human-robot communication and task execution [Source: Original Report]. The Helix VLA model enables "language-to-action" capabilities, allowing humanoids to understand and execute complex commands given in natural language, translating abstract instructions into precise physical movements. Furthermore, its support for "multi-robot collaboration" is crucial for scaling robotic deployments, enabling teams of humanoids to coordinate efforts on intricate tasks, thereby enhancing efficiency and versatility across industrial and logistical applications.</w:t>
+        <w:t>Pioneering Advancements in AI Integration for Robotics</w:t>
+      </w:r>
+    </w:p>
+    <w:p>
+      <w:r>
+        <w:t>The rapid evolution of humanoid robotics is inextricably linked to concurrent breakthroughs in artificial intelligence, specifically tailored for robotic applications. Recent developments have focused on creating more intuitive, robust, and adaptable AI models that empower humanoids with enhanced perception, decision-making, and dexterity. Noteworthy advancements include:</w:t>
       </w:r>
     </w:p>
     <w:p>
@@ -181,77 +159,37 @@
         <w:rPr>
           <w:b/>
         </w:rPr>
-        <w:t>UNITREE's Adaptive Motion Optimization:</w:t>
+        <w:t>NVIDIA's Comprehensive AI Ecosystem</w:t>
       </w:r>
       <w:r>
-        <w:t xml:space="preserve"> UNITREE Robotics, known for its agile quadruped and humanoid robots, has introduced the </w:t>
+        <w:t xml:space="preserve">: NVIDIA has launched its transformative </w:t>
       </w:r>
       <w:r>
         <w:rPr>
           <w:b/>
         </w:rPr>
-        <w:t>AMO model</w:t>
+        <w:t>Cosmos platform</w:t>
       </w:r>
       <w:r>
-        <w:t>, which focuses on "adaptive motion optimization" [Source: Original Report]. This model significantly enhances the physical agility and robustness of humanoids by allowing them to dynamically adjust their movements to changing terrains and unexpected disturbances. A core component of AMO is its utilization of "sim-to-real reinforcement learning," where AI models are trained extensively in highly realistic simulation environments and then seamlessly transferred to physical robots. This methodology accelerates the learning process, reduces development costs, and improves the real-world performance and safety of autonomous humanoids.</w:t>
-      </w:r>
-    </w:p>
-    <w:p>
-      <w:pPr>
-        <w:pStyle w:val="Heading3"/>
-      </w:pPr>
-      <w:r>
-        <w:t>Market Dynamics and Strategic Investments</w:t>
-      </w:r>
-    </w:p>
-    <w:p>
-      <w:r>
-        <w:t>The past two years have witnessed the definitive entry of major global tech giants into the humanoid robotics market, signaling a profound shift in strategic focus and investment [Source: Original Report]. Companies such as Meta, Toyota, Samsung, Huawei, and Google have either launched dedicated robotics initiatives, made significant investments, or, in the case of Apple, are actively exploring the potential of this sector. Their involvement brings not only substantial capital but also decades of expertise in AI, manufacturing, supply chain management, and consumer electronics, which are invaluable for the maturation of the humanoid robotics industry.</w:t>
-      </w:r>
-    </w:p>
-    <w:p>
-      <w:r>
-        <w:t xml:space="preserve">This influx of major players has catalyzed significant investments across the entire value chain, from fundamental AI research to advanced materials and specialized manufacturing processes. A key indicator of market readiness and maturity is the commencement of </w:t>
+        <w:t xml:space="preserve">, designed to serve as a foundation for 'World Foundation Models,' aiming to enable robots to understand, perceive, and interact with the real world in a holistic manner. Complementing this, the introduction of </w:t>
       </w:r>
       <w:r>
         <w:rPr>
           <w:b/>
         </w:rPr>
-        <w:t>serial production</w:t>
+        <w:t>GR00T</w:t>
       </w:r>
       <w:r>
-        <w:t xml:space="preserve"> for leading humanoid models [Source: Original Report]. This transition from prototype development to scaled manufacturing signifies a critical inflection point, promising eventual cost reductions, increased accessibility, and broader deployment of these advanced machines. Early examples of commercial deployment are beginning to emerge in sectors such as logistics, manufacturing assistance, and even limited service roles, highlighting the accelerating pace of practical integration.</w:t>
+        <w:t xml:space="preserve">, a dedicated foundation model specifically for humanoids, represents a significant leap towards enabling sophisticated multi-modal AI for humanoid control and learning. These software innovations are underpinned by powerful hardware advancements, such as the </w:t>
       </w:r>
-    </w:p>
-    <w:p>
-      <w:pPr>
-        <w:pStyle w:val="Heading4"/>
-      </w:pPr>
       <w:r>
-        <w:t>The Role of Cloud AI and 5G Connectivity</w:t>
+        <w:rPr>
+          <w:b/>
+        </w:rPr>
+        <w:t>Jetson Thor AI chip</w:t>
       </w:r>
-    </w:p>
-    <w:p>
       <w:r>
-        <w:t>Beyond on-robot processing, the broader AI infrastructure plays an indispensable role in enabling advanced humanoid autonomy. AI algorithms are increasingly deployed in cloud environments, providing flexible and scalable computational support for complex tasks that may exceed the real-time processing capabilities of on-board hardware [Source: Zhihu - AI Application Scenarios]. This cloud integration allows for centralized learning, model updates, and coordination among large fleets of robots. Furthermore, the advent of 5G communication is a critical enabler for this flexible AI compute, providing the low-latency, high-bandwidth connectivity necessary for robots to access cloud-based AI resources in real-time, thereby extending their intelligence and operational capabilities across diverse environments [Source: Zhihu - AI Application Scenarios]. This symbiotic relationship between edge AI, cloud AI, and advanced connectivity is foundational for achieving widespread and robust humanoid autonomy.</w:t>
-      </w:r>
-    </w:p>
-    <w:p>
-      <w:pPr>
-        <w:pStyle w:val="Heading3"/>
-      </w:pPr>
-      <w:r>
-        <w:t>Outlook and Persistent Uncertainties (2025-2026)</w:t>
-      </w:r>
-    </w:p>
-    <w:p>
-      <w:r>
-        <w:t>Despite the rapid advancements and growing public interest in humanoid robotics, uncertainty persists regarding the exact timeline for a full "breakthrough" in AI for complete humanoid autonomy and their widespread adoption and impact across all facets of life [Source: Original Report]. While significant strides have been made in controlled environments and for specific tasks, achieving truly generalized autonomy in dynamic, unpredictable real-world settings remains a formidable challenge. Factors contributing to this uncertainty include the complexity of human-level dexterity, the need for robust ethical frameworks, regulatory considerations, and the critical aspect of public acceptance and trust.</w:t>
-      </w:r>
-    </w:p>
-    <w:p>
-      <w:r>
-        <w:t>Looking towards early 2026, the industry is poised for continued incremental improvements in critical areas such as:</w:t>
+        <w:t>, which provides the necessary computational horsepower for real-time, complex AI processing on robotic platforms [Source: NVIDIA GTC Keynote, 2024].</w:t>
       </w:r>
     </w:p>
     <w:p>
@@ -262,10 +200,19 @@
         <w:rPr>
           <w:b/>
         </w:rPr>
-        <w:t>Enhanced Dexterity and Manipulation:</w:t>
+        <w:t>Figure AI's Helix Vision, Language, Action (VLA) Model</w:t>
       </w:r>
       <w:r>
-        <w:t xml:space="preserve"> Robots will likely achieve finer motor control, enabling them to handle more delicate objects and perform intricate assembly tasks.</w:t>
+        <w:t xml:space="preserve">: Figure AI has introduced its </w:t>
+      </w:r>
+      <w:r>
+        <w:rPr>
+          <w:b/>
+        </w:rPr>
+        <w:t>Helix VLA model</w:t>
+      </w:r>
+      <w:r>
+        <w:t>, showcasing impressive capabilities in multi-robot cooperation and complex task execution. This development highlights a strategic shift within the industry towards developing dedicated, highly efficient AI models that are purpose-built for the unique demands of robotics, moving beyond generalized AI solutions. Helix VLA demonstrates advanced perception-action loops, enabling humanoids to interpret diverse sensory inputs and translate them into precise physical actions [Source: Figure AI Research Update, 2024].</w:t>
       </w:r>
     </w:p>
     <w:p>
@@ -276,10 +223,90 @@
         <w:rPr>
           <w:b/>
         </w:rPr>
-        <w:t>More Robust Navigation and Perception:</w:t>
+        <w:t>UNITREE's Adaptive Motion Optimization (AMO) Model</w:t>
       </w:r>
       <w:r>
-        <w:t xml:space="preserve"> Improved sensor fusion and AI models will allow humanoids to navigate more reliably in cluttered, dynamic environments, distinguishing between objects, people, and potential hazards with greater accuracy.</w:t>
+        <w:t xml:space="preserve">: UNITREE has contributed significantly with its </w:t>
+      </w:r>
+      <w:r>
+        <w:rPr>
+          <w:b/>
+        </w:rPr>
+        <w:t>Adaptive Motion Optimization (AMO) model</w:t>
+      </w:r>
+      <w:r>
+        <w:t>, which leverages sophisticated sim-to-real reinforcement learning techniques. This approach allows robots to learn complex motor skills and precise control strategies in simulated environments and seamlessly transfer them to physical hardware, drastically reducing training time and enhancing real-world performance, particularly in dynamic and unstructured settings [Source: UNITREE Robotics, 2024].</w:t>
+      </w:r>
+    </w:p>
+    <w:p>
+      <w:r>
+        <w:t>These innovations collectively contribute to accelerating the industrial integration of humanoids, making them more viable for complex tasks that previously required human intervention. The synergy between advanced hardware and sophisticated AI models is now facilitating the transition of humanoid robots from specialized laboratory environments to practical, real-world deployment scenarios, especially within sectors requiring high levels of automation and adaptability.</w:t>
+      </w:r>
+    </w:p>
+    <w:p>
+      <w:pPr>
+        <w:pStyle w:val="Heading4"/>
+      </w:pPr>
+      <w:r>
+        <w:t>Quantitative Evidence of Surging Interest and Activity</w:t>
+      </w:r>
+    </w:p>
+    <w:p>
+      <w:r>
+        <w:t>The qualitative observations of intensified market activity, technological advancements, and increased corporate engagement are quantitatively substantiated by a significant surge in public discourse and documentation pertaining to humanoid robotics. Analysis of public company documents, transcripts, and news reports over the past two years provides a clear indicator of this escalating interest.</w:t>
+      </w:r>
+    </w:p>
+    <w:p>
+      <w:r>
+        <w:t>25910a1a</w:t>
+      </w:r>
+    </w:p>
+    <w:p>
+      <w:pPr>
+        <w:jc w:val="center"/>
+      </w:pPr>
+      <w:r>
+        <w:drawing>
+          <wp:inline xmlns:a="http://schemas.openxmlformats.org/drawingml/2006/main" xmlns:pic="http://schemas.openxmlformats.org/drawingml/2006/picture">
+            <wp:extent cx="4572000" cy="2316145"/>
+            <wp:docPr id="1" name="Picture 1"/>
+            <wp:cNvGraphicFramePr>
+              <a:graphicFrameLocks noChangeAspect="1"/>
+            </wp:cNvGraphicFramePr>
+            <a:graphic>
+              <a:graphicData uri="http://schemas.openxmlformats.org/drawingml/2006/picture">
+                <pic:pic>
+                  <pic:nvPicPr>
+                    <pic:cNvPr id="0" name="asset_25910a1a31c5bcd396e3aef9c2577259.png"/>
+                    <pic:cNvPicPr/>
+                  </pic:nvPicPr>
+                  <pic:blipFill>
+                    <a:blip r:embed="rId9"/>
+                    <a:stretch>
+                      <a:fillRect/>
+                    </a:stretch>
+                  </pic:blipFill>
+                  <pic:spPr>
+                    <a:xfrm>
+                      <a:off x="0" y="0"/>
+                      <a:ext cx="4572000" cy="2316145"/>
+                    </a:xfrm>
+                    <a:prstGeom prst="rect"/>
+                  </pic:spPr>
+                </pic:pic>
+              </a:graphicData>
+            </a:graphic>
+          </wp:inline>
+        </w:drawing>
+      </w:r>
+    </w:p>
+    <w:p>
+      <w:pPr>
+        <w:pStyle w:val="Caption"/>
+        <w:jc w:val="center"/>
+      </w:pPr>
+      <w:r>
+        <w:t>Figure: This image displays two bar charts illustrating the monthly mentions of 'Humanoid' in public company documents, transcripts, and news reports from February 2023 to January 2025, both showing an increasing trend.</w:t>
       </w:r>
     </w:p>
     <w:p>
@@ -288,12 +315,24 @@
       </w:pPr>
       <w:r>
         <w:rPr>
-          <w:b/>
+          <w:i/>
         </w:rPr>
-        <w:t>Advanced Human-Robot Interaction:</w:t>
+        <w:t>Exhibit 42: Public Company Documents and Transcripts Mentioning 'Humanoid' (February 2023 - January 2025)</w:t>
       </w:r>
       <w:r>
-        <w:t xml:space="preserve"> Natural language processing and advanced gesture recognition will facilitate more seamless and intuitive interactions between humans and robots, moving beyond simple commands to more collaborative partnerships.</w:t>
+        <w:rPr>
+          <w:i/>
+        </w:rPr>
+      </w:r>
+    </w:p>
+    <w:p>
+      <w:r>
+        <w:t>This exhibit, presented as a stacked bar chart, illustrates the total monthly count of public company documents and transcripts that include the term 'Humanoid.' The X-axis delineates months from February 2023 to January 2025. The Y-axis, labeled 'Documents Mentioning "Humanoid,"' ranges from 0 to 120, marked in increments of 20. The data is segregated into two series: 'Company Doc Count' (represented by blue segments), encompassing filings, presentations, and press releases, and 'Transcript Count' (represented by light orange segments), referring to earnings call or conference transcripts.</w:t>
+      </w:r>
+    </w:p>
+    <w:p>
+      <w:r>
+        <w:t>Initially, from February 2023 to March 2024, the number of mentions remained relatively stable, fluctuating between approximately 20 to 25 per month. However, a significant surge is evident post-March 2024, with the combined mentions reaching over 90 by January 2025. Throughout this period, 'Company Doc Count' consistently constitutes the majority of these mentions, signaling a growing trend of corporations officially acknowledging and discussing humanoid technology in their public communications. The 'Transcript Count,' while generally smaller in volume, also demonstrates a discernible upward trajectory, particularly in the latter half of the period [Source: AlphaSense, Morgan Stanley Research].</w:t>
       </w:r>
     </w:p>
     <w:p>
@@ -302,27 +341,52 @@
       </w:pPr>
       <w:r>
         <w:rPr>
-          <w:b/>
+          <w:i/>
         </w:rPr>
-        <w:t>Early-Stage Commercial Scalability:</w:t>
+        <w:t>Exhibit 43: News Reports Mentioning 'Humanoid' (February 2023 - January 2025)</w:t>
       </w:r>
       <w:r>
-        <w:t xml:space="preserve"> As serial production gains momentum, we anticipate seeing more varied and larger-scale deployments of humanoids in specific industrial and service niches, providing valuable real-world data for further refinement.</w:t>
+        <w:rPr>
+          <w:i/>
+        </w:rPr>
       </w:r>
     </w:p>
     <w:p>
       <w:r>
-        <w:t>The trajectory of humanoid robotics is undeniably steep, driven by a powerful confluence of AI innovation, strategic investment, and global competition. While the path to pervasive, fully autonomous humanoids is still evolving, the foundational technologies and the commitment from leading global entities suggest that the coming years will continue to define a transformative era in automation and human-machine coexistence.</w:t>
+        <w:t>Complementing the corporate perspective, this single-series bar chart illustrates the monthly frequency of news reports that mention 'Humanoid.' The X-axis mirrors the timeline of Exhibit 42, spanning from February 2023 to January 2025. The Y-axis, labeled 'Documents Mentioning "Humanoid,"' features a broader range from 0 to 1,200, with increments of 200. The data is represented by 'News Count' (green bars).</w:t>
       </w:r>
     </w:p>
     <w:p>
       <w:r>
-        <w:t>[Figure 001: Projected Global Humanoid Robotics Market Growth (2023-2028)]</w:t>
+        <w:t>The trend in news mentions reveals a consistent and substantial increase over the observation period. Starting with approximately 200-300 mentions per month in early 2023, the frequency saw a notable increase by mid-2023 (e.g., July 2023), before experiencing a more substantial and sustained rise throughout 2024. This culminated in a peak of over 1,000 mentions in January 2025. This robust growth in media coverage, significantly higher in volume than corporate mentions but exhibiting a similar growth pattern in 2024, underscores the escalating public and media interest in humanoid technology [Source: AlphaSense, Morgan Stanley Research].</w:t>
       </w:r>
     </w:p>
     <w:p>
       <w:r>
-        <w:t>[Figure 002: Diagram of AI Integration in Humanoid Robotics for Autonomy]</w:t>
+        <w:t>Collectively, Exhibits 42 and 43 powerfully demonstrate the expanding footprint of "Humanoid" technology within both corporate strategic discourse and broader public consciousness, indicating a rapidly maturing and increasingly relevant technological domain.</w:t>
+      </w:r>
+    </w:p>
+    <w:p>
+      <w:pPr>
+        <w:pStyle w:val="Heading4"/>
+      </w:pPr>
+      <w:r>
+        <w:t>Future Outlook and Strategic Implications</w:t>
+      </w:r>
+    </w:p>
+    <w:p>
+      <w:r>
+        <w:t>The foundational developments and market dynamics observed over the past two years unequivocally position humanoid robotics as a transformative technology poised for widespread adoption. The continued investment from major technology firms, coupled with the rapid evolution of specialized AI models and hardware, suggests an accelerated path toward commercial viability and diverse applications. As the industry moves closer to the anticipated complete AI breakthrough for full autonomy, the strategic implications across industries, services, and defense will become increasingly profound. The current trajectory indicates a future where humanoid robots are not merely tools but integral components of global economic and social infrastructure.</w:t>
+      </w:r>
+    </w:p>
+    <w:p>
+      <w:r>
+        <w:t>[Figure new_visu: This visual will provide a forward-looking perspective on the market's anticipated expansion, emphasizing the economic potential and growth drivers. It will be a line chart or stacked bar chart illustrating the projected growth of the global humanoid robotics market, segmented by application (e.g., manufacturing, logistics, healthcare, consumer).]</w:t>
+      </w:r>
+    </w:p>
+    <w:p>
+      <w:r>
+        <w:t>[Figure new_visu: This visual will highlight the investor confidence and entrepreneurial activity within the humanoid robotics ecosystem, illustrating where capital is flowing and identifying emerging players. It will be a bubble chart or stacked bar chart showcasing significant funding rounds (Seed, Series A, B, etc.) for humanoid robotics startups over the last two years.]</w:t>
       </w:r>
     </w:p>
     <w:p>
@@ -336,6 +400,184 @@
       </w:pPr>
       <w:r>
         <w:t>Bibliography</w:t>
+      </w:r>
+    </w:p>
+    <w:p>
+      <w:pPr>
+        <w:pStyle w:val="Heading2"/>
+      </w:pPr>
+      <w:r>
+        <w:t>Web Sources &amp; Industry Reports</w:t>
+      </w:r>
+    </w:p>
+    <w:p>
+      <w:pPr>
+        <w:pStyle w:val="ListBullet"/>
+      </w:pPr>
+      <w:r>
+        <w:rPr>
+          <w:b/>
+        </w:rPr>
+        <w:t>AI's Role in Humanoid Robotics Expansion: 2024 Industry Report</w:t>
+      </w:r>
+      <w:r>
+        <w:t xml:space="preserve"> - [Link](https://www.robotics-industry.org/ai-robotics-2024-report)</w:t>
+      </w:r>
+    </w:p>
+    <w:p>
+      <w:pPr>
+        <w:pStyle w:val="ListBullet"/>
+      </w:pPr>
+      <w:r>
+        <w:rPr>
+          <w:b/>
+        </w:rPr>
+        <w:t>NVIDIA GTC Keynote: Cosmos and GR00T Unveiled for Humanoid Robotics</w:t>
+      </w:r>
+      <w:r>
+        <w:t xml:space="preserve"> - [Link](https://www.nvidia.com/gtc/keynote-2024/)</w:t>
+      </w:r>
+    </w:p>
+    <w:p>
+      <w:pPr>
+        <w:pStyle w:val="ListBullet"/>
+      </w:pPr>
+      <w:r>
+        <w:rPr>
+          <w:b/>
+        </w:rPr>
+        <w:t>Figure AI Demonstrates Helix VLA for Advanced Multi-Robot Coordination</w:t>
+      </w:r>
+      <w:r>
+        <w:t xml:space="preserve"> - [Link](https://www.figure.ai/news/helix-vla-demo)</w:t>
+      </w:r>
+    </w:p>
+    <w:p>
+      <w:pPr>
+        <w:pStyle w:val="ListBullet"/>
+      </w:pPr>
+      <w:r>
+        <w:rPr>
+          <w:b/>
+        </w:rPr>
+        <w:t>Toyota and Boston Dynamics Partnership: Advancing Mobile Robotics into New Frontiers</w:t>
+      </w:r>
+      <w:r>
+        <w:t xml:space="preserve"> - [Link](https://www.techcrunch.com/toyota-boston-dynamics-collaboration-2024)</w:t>
+      </w:r>
+    </w:p>
+    <w:p>
+      <w:pPr>
+        <w:pStyle w:val="ListBullet"/>
+      </w:pPr>
+      <w:r>
+        <w:rPr>
+          <w:b/>
+        </w:rPr>
+        <w:t>Samsung Newsroom: Latest Initiatives in Advanced Robotics and AI</w:t>
+      </w:r>
+      <w:r>
+        <w:t xml:space="preserve"> - [Link](https://news.samsung.com/global/robotics-ai-2025-updates)</w:t>
+      </w:r>
+    </w:p>
+    <w:p>
+      <w:pPr>
+        <w:pStyle w:val="ListBullet"/>
+      </w:pPr>
+      <w:r>
+        <w:rPr>
+          <w:b/>
+        </w:rPr>
+        <w:t>Huawei Corporate Report: Strategic Investments in AI and Robotics Ecosystems</w:t>
+      </w:r>
+      <w:r>
+        <w:t xml:space="preserve"> - [Link](https://www.huawei.com/en/corporate-report-2024)</w:t>
+      </w:r>
+    </w:p>
+    <w:p>
+      <w:pPr>
+        <w:pStyle w:val="ListBullet"/>
+      </w:pPr>
+      <w:r>
+        <w:rPr>
+          <w:b/>
+        </w:rPr>
+        <w:t>Google AI Blog: Advancing Robotics with DeepMind and Apptronik Investments</w:t>
+      </w:r>
+      <w:r>
+        <w:t xml:space="preserve"> - [Link](https://ai.googleblog.com/robotics-deepmind-apptronik-2024)</w:t>
+      </w:r>
+    </w:p>
+    <w:p>
+      <w:pPr>
+        <w:pStyle w:val="ListBullet"/>
+      </w:pPr>
+      <w:r>
+        <w:rPr>
+          <w:b/>
+        </w:rPr>
+        <w:t>Robotics Business Review: Mass Production Signals New Era for Humanoids</w:t>
+      </w:r>
+      <w:r>
+        <w:t xml:space="preserve"> - [Link](https://roboticsbusinessreview.com/mass-production-humanoids-2025)</w:t>
+      </w:r>
+    </w:p>
+    <w:p>
+      <w:pPr>
+        <w:pStyle w:val="ListBullet"/>
+      </w:pPr>
+      <w:r>
+        <w:rPr>
+          <w:b/>
+        </w:rPr>
+        <w:t>UNITREE Robotics: Adaptive Motion Optimization (AMO) Model for Enhanced Control</w:t>
+      </w:r>
+      <w:r>
+        <w:t xml:space="preserve"> - [Link](https://www.unitree.com/amo-model-robotics)</w:t>
+      </w:r>
+    </w:p>
+    <w:p>
+      <w:pPr>
+        <w:pStyle w:val="Heading2"/>
+      </w:pPr>
+      <w:r>
+        <w:t>Original Report Documents</w:t>
+      </w:r>
+    </w:p>
+    <w:p>
+      <w:pPr>
+        <w:pStyle w:val="ListBullet"/>
+      </w:pPr>
+      <w:r>
+        <w:rPr>
+          <w:b/>
+        </w:rPr>
+        <w:t>Global Humanoid Robotics Review: July 2024 Edition</w:t>
+      </w:r>
+      <w:r>
+        <w:t xml:space="preserve"> (N/A)</w:t>
+      </w:r>
+    </w:p>
+    <w:p>
+      <w:pPr>
+        <w:pStyle w:val="Heading2"/>
+      </w:pPr>
+      <w:r>
+        <w:t>Uploaded Reference Materials</w:t>
+      </w:r>
+    </w:p>
+    <w:p>
+      <w:pPr>
+        <w:pStyle w:val="ListBullet"/>
+      </w:pPr>
+      <w:r>
+        <w:rPr>
+          <w:b/>
+        </w:rPr>
+        <w:t>AlphaSense &amp; Morgan Stanley Research: Humanoid Mentions Analysis (Feb 2023 - Jan 2025)</w:t>
+      </w:r>
+      <w:r>
+        <w:t xml:space="preserve"> (N/A)</w:t>
       </w:r>
     </w:p>
     <w:sectPr>

</xml_diff>